<commit_message>
Align M08 date fit with simulation plan
Co-authored-by: shaseaver25 <shannon@tailoredu.org>
</commit_message>
<xml_diff>
--- a/teaching-pack/12-M08-spurious-correlation/FOREMAN-M08-deterioration-report.docx
+++ b/teaching-pack/12-M08-spurious-correlation/FOREMAN-M08-deterioration-report.docx
@@ -47,7 +47,7 @@
           <w:i w:val="0"/>
           <w:sz w:val="19"/>
         </w:rPr>
-        <w:t>Midspan strain has increased steadily since February 1. The fitted date trend has R² = 0.89, indicating progressive structural deterioration.</w:t>
+        <w:t>Midspan strain has increased steadily since February 1. The fitted date trend has R² = 0.87, indicating progressive structural deterioration.</w:t>
       </w:r>
     </w:p>
     <w:p>
@@ -285,7 +285,7 @@
                 <w:i w:val="0"/>
                 <w:sz w:val="16"/>
               </w:rPr>
-              <w:t>7.95 µε/day</w:t>
+              <w:t>8.12 µε/day</w:t>
             </w:r>
           </w:p>
         </w:tc>
@@ -304,7 +304,7 @@
                 <w:i w:val="0"/>
                 <w:sz w:val="16"/>
               </w:rPr>
-              <w:t>0.891</w:t>
+              <w:t>0.870</w:t>
             </w:r>
           </w:p>
         </w:tc>

</xml_diff>